<commit_message>
Staff can edit books/copies/covers and member records directly; catalog guard separated from goal review; member-edit audit fields added
</commit_message>
<xml_diff>
--- a/docs/LIRC_System_Documentation.docx
+++ b/docs/LIRC_System_Documentation.docx
@@ -54,7 +54,7 @@
           <w:sz w:val="20"/>
           <w:szCs w:val="20"/>
         </w:rPr>
-        <w:t xml:space="preserve">Generated Mon Oct 19 2026</w:t>
+        <w:t xml:space="preserve">Generated Wed Oct 21 2026</w:t>
       </w:r>
     </w:p>
     <w:p>
@@ -262,7 +262,7 @@
                 <w:sz w:val="18"/>
                 <w:szCs w:val="18"/>
               </w:rPr>
-              <w:t xml:space="preserve">Circulation desk staff: attendance desk, borrowing, returns, inventory, barcodes and member records. Member-data edits are sent for admin approval.</w:t>
+              <w:t xml:space="preserve">Circulation desk staff: attendance desk, borrowing, returns, inventory, barcodes, member records and catalog editing (books, copies, covers). Member edits are saved directly and recorded in the activity log.</w:t>
             </w:r>
           </w:p>
         </w:tc>
@@ -292,7 +292,7 @@
                 <w:sz w:val="18"/>
                 <w:szCs w:val="18"/>
               </w:rPr>
-              <w:t xml:space="preserve">Runs the library: catalog (add books, covers), enrollment validation, academic periods, member records, Path Finder curation and the AI tools. Some member-data edits need admin approval.</w:t>
+              <w:t xml:space="preserve">Runs the library: catalog, enrollment validation, academic periods, member records, Path Finder curation and the AI tools. Member edits apply directly and are recorded in the activity log.</w:t>
             </w:r>
           </w:p>
         </w:tc>
@@ -322,7 +322,7 @@
                 <w:sz w:val="18"/>
                 <w:szCs w:val="18"/>
               </w:rPr>
-              <w:t xml:space="preserve">Full control: settings (fines), announcements, user logs and performance, and approval of change requests. The only role that manages other admins.</w:t>
+              <w:t xml:space="preserve">Full control: settings (fines), announcements, user logs and performance, plus approval of any older change requests. The only role that manages other admins.</w:t>
             </w:r>
           </w:p>
         </w:tc>
@@ -4154,7 +4154,7 @@
           <w:sz w:val="21"/>
           <w:szCs w:val="21"/>
         </w:rPr>
-        <w:t xml:space="preserve">Librarians and admins additionally see Edit and cover-upload actions on the book window.</w:t>
+        <w:t xml:space="preserve">Staff, librarians and admins additionally see Edit and cover-upload actions on the book window.</w:t>
       </w:r>
     </w:p>
     <w:p>
@@ -4202,7 +4202,7 @@
           <w:sz w:val="21"/>
           <w:szCs w:val="21"/>
         </w:rPr>
-        <w:t xml:space="preserve">Librarian, admin</w:t>
+        <w:t xml:space="preserve">Staff, librarian, admin</w:t>
       </w:r>
       <w:r>
         <w:rPr>
@@ -4256,22 +4256,22 @@
           <w:sz w:val="21"/>
           <w:szCs w:val="21"/>
         </w:rPr>
-        <w:t xml:space="preserve">Editing is librarian/admin only (server-guarded); the editable fields are limited to catalog fields — IDs and timestamps cannot be changed from a browser.</w:t>
-      </w:r>
-    </w:p>
-    <w:p>
-      <w:pPr>
-        <w:numPr>
-          <w:ilvl w:val="0"/>
-          <w:numId w:val="1"/>
-        </w:numPr>
-      </w:pPr>
-      <w:r>
-        <w:rPr>
-          <w:sz w:val="21"/>
-          <w:szCs w:val="21"/>
-        </w:rPr>
-        <w:t xml:space="preserve">Cover uploads: librarian/admin only, WebP only, insert-only (no overwriting or deleting files).</w:t>
+        <w:t xml:space="preserve">Editing is open to library staff (staff/librarian/admin, server-guarded); the editable fields are limited to catalog fields — IDs and timestamps cannot be changed from a browser.</w:t>
+      </w:r>
+    </w:p>
+    <w:p>
+      <w:pPr>
+        <w:numPr>
+          <w:ilvl w:val="0"/>
+          <w:numId w:val="1"/>
+        </w:numPr>
+      </w:pPr>
+      <w:r>
+        <w:rPr>
+          <w:sz w:val="21"/>
+          <w:szCs w:val="21"/>
+        </w:rPr>
+        <w:t xml:space="preserve">Cover uploads: library staff only, WebP only, insert-only (no overwriting or deleting files).</w:t>
       </w:r>
     </w:p>
     <w:p>
@@ -5105,22 +5105,22 @@
           <w:sz w:val="21"/>
           <w:szCs w:val="21"/>
         </w:rPr>
-        <w:t xml:space="preserve">Edit member details; librarians/staff send edits as change requests, admins apply them directly.</w:t>
-      </w:r>
-    </w:p>
-    <w:p>
-      <w:pPr>
-        <w:numPr>
-          <w:ilvl w:val="0"/>
-          <w:numId w:val="1"/>
-        </w:numPr>
-      </w:pPr>
-      <w:r>
-        <w:rPr>
-          <w:sz w:val="21"/>
-          <w:szCs w:val="21"/>
-        </w:rPr>
-        <w:t xml:space="preserve">Review change requests (admin): approve or reject with a reason.</w:t>
+        <w:t xml:space="preserve">Edit member details directly; the activity log records who changed what.</w:t>
+      </w:r>
+    </w:p>
+    <w:p>
+      <w:pPr>
+        <w:numPr>
+          <w:ilvl w:val="0"/>
+          <w:numId w:val="1"/>
+        </w:numPr>
+      </w:pPr>
+      <w:r>
+        <w:rPr>
+          <w:sz w:val="21"/>
+          <w:szCs w:val="21"/>
+        </w:rPr>
+        <w:t xml:space="preserve">Review change requests (admin): approve or reject an older pending request with a reason.</w:t>
       </w:r>
     </w:p>
     <w:p>
@@ -5152,7 +5152,7 @@
           <w:sz w:val="21"/>
           <w:szCs w:val="21"/>
         </w:rPr>
-        <w:t xml:space="preserve">: Search and view records; add members; edit member details as change requests (waiting for admin approval).</w:t>
+        <w:t xml:space="preserve">: Search and view records; add members; edit member details directly (recorded in the activity log).</w:t>
       </w:r>
     </w:p>
     <w:p>
@@ -5198,7 +5198,7 @@
           <w:sz w:val="21"/>
           <w:szCs w:val="21"/>
         </w:rPr>
-        <w:t xml:space="preserve">: Everything, plus direct edits and reviewing/approving change requests; the only role that can create another admin.</w:t>
+        <w:t xml:space="preserve">: Everything, plus reviewing/approving any older change requests; the only role that can create another admin.</w:t>
       </w:r>
     </w:p>
     <w:p>
@@ -5237,7 +5237,7 @@
           <w:sz w:val="21"/>
           <w:szCs w:val="21"/>
         </w:rPr>
-        <w:t xml:space="preserve">Member edits by staff/librarian wait for admin approval; only admins review change requests; only admins can add another admin.</w:t>
+        <w:t xml:space="preserve">Member edits are saved directly by staff/librarian/admin and recorded in the activity log; only admins can add another admin. Older pending change requests can still be approved.</w:t>
       </w:r>
     </w:p>
     <w:p>
@@ -6447,7 +6447,7 @@
           <w:sz w:val="21"/>
           <w:szCs w:val="21"/>
         </w:rPr>
-        <w:t xml:space="preserve">Librarian, admin</w:t>
+        <w:t xml:space="preserve">Staff, librarian, admin</w:t>
       </w:r>
       <w:r>
         <w:rPr>
@@ -6478,7 +6478,7 @@
           <w:sz w:val="21"/>
           <w:szCs w:val="21"/>
         </w:rPr>
-        <w:t xml:space="preserve">Librarian/admin only (server-guarded).</w:t>
+        <w:t xml:space="preserve">Library staff only (server-guarded).</w:t>
       </w:r>
     </w:p>
     <w:p>

</xml_diff>

<commit_message>
Path Finder: General Education shared subject lists with the PDF book pass; highlighted Shelf line in book details
</commit_message>
<xml_diff>
--- a/docs/LIRC_System_Documentation.docx
+++ b/docs/LIRC_System_Documentation.docx
@@ -4139,7 +4139,7 @@
           <w:sz w:val="21"/>
           <w:szCs w:val="21"/>
         </w:rPr>
-        <w:t xml:space="preserve">Book window: full catalog details, cover (uploaded image first, then the Open Library API by ISBN, then a placeholder), physical copies with their status, and borrow history (operators).</w:t>
+        <w:t xml:space="preserve">Book window: full catalog details, the book's shelf/location highlighted right below the author ("Shelf: …"), cover (uploaded image first, then the Open Library API by ISBN, then a placeholder), physical copies with their status, and borrow history (operators).</w:t>
       </w:r>
     </w:p>
     <w:p>
@@ -4454,6 +4454,21 @@
           <w:sz w:val="21"/>
           <w:szCs w:val="21"/>
         </w:rPr>
+        <w:t xml:space="preserve">General Education: the picker's first option lists the shared Gen Ed subjects (Understanding the Self, Ethics, Rizal, PATHFit, NSTP, …). A book added on any subject of a Gen Ed group appears on every program's matching subject — one list even when the course code differs (for example RPH201, RPH202 and RPH301).</w:t>
+      </w:r>
+    </w:p>
+    <w:p>
+      <w:pPr>
+        <w:numPr>
+          <w:ilvl w:val="0"/>
+          <w:numId w:val="1"/>
+        </w:numPr>
+      </w:pPr>
+      <w:r>
+        <w:rPr>
+          <w:sz w:val="21"/>
+          <w:szCs w:val="21"/>
+        </w:rPr>
         <w:t xml:space="preserve">Faculty: "Suggest a book" on any subject — suggestions wait for librarian review; the faculty member sees their pending note on the card.</w:t>
       </w:r>
     </w:p>
@@ -4562,7 +4577,7 @@
           <w:sz w:val="21"/>
           <w:szCs w:val="21"/>
         </w:rPr>
-        <w:t xml:space="preserve">: Curate subject lists, review suggestions, run AI research, manage the acquisition queue and export it.</w:t>
+        <w:t xml:space="preserve">: Curate subject lists (including the shared General Education list), review suggestions, run AI research, manage the acquisition queue and export it.</w:t>
       </w:r>
     </w:p>
     <w:p>
@@ -4654,7 +4669,7 @@
           <w:sz w:val="21"/>
           <w:szCs w:val="21"/>
         </w:rPr>
-        <w:t xml:space="preserve">A book cannot be added to the same subject or the acquisition list twice while a request is open.</w:t>
+        <w:t xml:space="preserve">A book cannot be added to the same subject (or the same Gen Ed group) or the acquisition list twice while a request is open.</w:t>
       </w:r>
     </w:p>
     <w:p>

</xml_diff>